<commit_message>
DSCW: propagate terminal growth revision (11.5% -> 5%) to the live site
- fair.full 1.29 -> 1.20 (bull-case DCF no longer clears the zero floor)
- CBE-rate lever recalibrated to the new sensitivity (impact 6.0 -> 4.2)
- study docx/xlsx/pdf refreshed with the full rebuild (all figures, §1.7
  disclosure of the anchor gap, Expert 3 branch convergence)
- noted, not fixed (pre-existing, unrelated): the CBE lever's min/max
  sign convention looks inverted vs the right=higher-value standard
</commit_message>
<xml_diff>
--- a/files/DSCW_Valuation_Study_19-07-2026_public.docx
+++ b/files/DSCW_Valuation_Study_19-07-2026_public.docx
@@ -412,7 +412,7 @@
           <w:sz w:val="19"/>
           <w:szCs w:val="19"/>
         </w:rPr>
-        <w:t xml:space="preserve">above the whole bear–bull span of 0.59–1.29</w:t>
+        <w:t xml:space="preserve">above the whole bear–bull span of 0.59–1.20</w:t>
       </w:r>
       <w:r>
         <w:rPr>
@@ -425,7 +425,7 @@
           <w:sz w:val="19"/>
           <w:szCs w:val="19"/>
         </w:rPr>
-        <w:t xml:space="preserve"> at today's sourced cost of capital. That sentence is the study. At the bottom-up WACC of 23.53% the DCF value of the equity is negative (−0.50/share, floored at zero in the blend and disclosed); the price only meets the model when the discount rate falls to </w:t>
+        <w:t xml:space="preserve"> at today's sourced cost of capital. That sentence is the study. At the bottom-up WACC of 23.53% the DCF value of the equity is negative (−0.51/share, floored at zero in the blend and disclosed); the price only meets the model when the discount rate falls to </w:t>
       </w:r>
       <w:r>
         <w:rPr>
@@ -438,7 +438,7 @@
           <w:sz w:val="19"/>
           <w:szCs w:val="19"/>
         </w:rPr>
-        <w:t xml:space="preserve">16.1% — the market-implied WACC</w:t>
+        <w:t xml:space="preserve">13.05% — the market-implied WACC</w:t>
       </w:r>
       <w:r>
         <w:rPr>
@@ -847,7 +847,7 @@
                 <w:sz w:val="17"/>
                 <w:szCs w:val="17"/>
               </w:rPr>
-              <w:t xml:space="preserve">0.33</w:t>
+              <w:t xml:space="preserve">0.06</w:t>
             </w:r>
           </w:p>
         </w:tc>
@@ -917,7 +917,7 @@
                 <w:sz w:val="17"/>
                 <w:szCs w:val="17"/>
               </w:rPr>
-              <w:t xml:space="preserve">raw -0.50: negative at WACC 23.53%; TV 94% of EV — disclosed</w:t>
+              <w:t xml:space="preserve">raw -0.51: negative at WACC 23.53%; TV 94% of EV — disclosed</w:t>
             </w:r>
           </w:p>
         </w:tc>
@@ -1487,7 +1487,7 @@
                 <w:sz w:val="17"/>
                 <w:szCs w:val="17"/>
               </w:rPr>
-              <w:t xml:space="preserve">1.29</w:t>
+              <w:t xml:space="preserve">1.20</w:t>
             </w:r>
           </w:p>
         </w:tc>
@@ -1559,7 +1559,7 @@
                 <w:sz w:val="17"/>
                 <w:szCs w:val="17"/>
               </w:rPr>
-              <w:t xml:space="preserve">spot 1.94 sits ~50% above even the bull central</w:t>
+              <w:t xml:space="preserve">spot 1.94 sits ~62% above even the bull central</w:t>
             </w:r>
           </w:p>
         </w:tc>
@@ -1580,7 +1580,7 @@
           <w:sz w:val="17"/>
           <w:szCs w:val="17"/>
         </w:rPr>
-        <w:t xml:space="preserve">The DCF and the market lenses are deliberately not blended into one point: the football field in §1.4 carries the divergence, and §4 reads it. The easing-path DCF (WACC 20.5%: -0.01) is dual-framed in §1.6 and never averaged in.</w:t>
+        <w:t xml:space="preserve">The DCF and the market lenses are deliberately not blended into one point: the football field in §1.4 carries the divergence, and §4 reads it. The easing-path DCF (WACC 20.5%: -0.17) is dual-framed in §1.6 and never averaged in.</w:t>
       </w:r>
     </w:p>
     <w:p>
@@ -3545,7 +3545,7 @@
           <w:sz w:val="19"/>
           <w:szCs w:val="19"/>
         </w:rPr>
-        <w:t xml:space="preserve">Five explicit years from the FY2025 base. Revenue is built bottom-up by segment (§1.5): export pieces +12% in FY26E fading to +5%, USD price +2% a year, the pound sliding gently to 58.5 by FY30E; retail decelerating from +46.6% to +12%; the dyeing and printing books compounding low-teens. The gross margin starts at 22.5% — below FY25's 25.2%, because Q1-26 says so — and recovers only to 26.0%, deliberately never to FY24's 34.0% devaluation-windfall peak. Capex runs 800 fading to 550; inventory days normalise from 202 to 160. The terminal value uses the value-driver formula with g 11.5% against a terminal ROIC of 22% — §1.7 reconciles both against the company's own history.</w:t>
+        <w:t xml:space="preserve">Five explicit years from the FY2025 base. Revenue is built bottom-up by segment (§1.5): export pieces +12% in FY26E fading to +5%, USD price +2% a year, the pound sliding gently to 58.5 by FY30E; retail decelerating from +46.6% to +12%; the dyeing and printing books compounding low-teens. The gross margin starts at 22.5% — below FY25's 25.2%, because Q1-26 says so — and recovers only to 26.0%, deliberately never to FY24's 34.0% devaluation-windfall peak. Capex runs 800 fading to 550; inventory days normalise from 202 to 160. The terminal value uses the value-driver formula with g 5% against a terminal ROIC of 22% — §1.7 reconciles both against the company's own history.</w:t>
       </w:r>
     </w:p>
     <w:tbl>
@@ -6185,7 +6185,7 @@
           <w:sz w:val="19"/>
           <w:szCs w:val="19"/>
         </w:rPr>
-        <w:t xml:space="preserve">EGP 2,455 mn · </w:t>
+        <w:t xml:space="preserve">EGP 2,430 mn · </w:t>
       </w:r>
       <w:r>
         <w:rPr>
@@ -6211,7 +6211,7 @@
           <w:sz w:val="19"/>
           <w:szCs w:val="19"/>
         </w:rPr>
-        <w:t xml:space="preserve">EGP 2,623 mn. Terminal value is </w:t>
+        <w:t xml:space="preserve">EGP 2,598 mn. Terminal value is </w:t>
       </w:r>
       <w:r>
         <w:rPr>
@@ -6452,7 +6452,7 @@
                 <w:sz w:val="17"/>
                 <w:szCs w:val="17"/>
               </w:rPr>
-              <w:t xml:space="preserve">2,623</w:t>
+              <w:t xml:space="preserve">2,598</w:t>
             </w:r>
           </w:p>
         </w:tc>
@@ -6775,7 +6775,7 @@
                 <w:sz w:val="17"/>
                 <w:szCs w:val="17"/>
               </w:rPr>
-              <w:t xml:space="preserve">-1,345 / -0.50</w:t>
+              <w:t xml:space="preserve">-1,370 / -0.51</w:t>
             </w:r>
           </w:p>
         </w:tc>
@@ -13427,7 +13427,7 @@
                 <w:sz w:val="17"/>
                 <w:szCs w:val="17"/>
               </w:rPr>
-              <w:t xml:space="preserve">Terminal g 11.5% / ROIC 22%</w:t>
+              <w:t xml:space="preserve">Terminal g 5.0% / ROIC 22%</w:t>
             </w:r>
           </w:p>
         </w:tc>
@@ -13462,7 +13462,7 @@
                 <w:sz w:val="17"/>
                 <w:szCs w:val="17"/>
               </w:rPr>
-              <w:t xml:space="preserve">judgment (reconciled)</w:t>
+              <w:t xml:space="preserve">judgment (override, disclosed)</w:t>
             </w:r>
           </w:p>
         </w:tc>
@@ -13497,7 +13497,7 @@
                 <w:sz w:val="17"/>
                 <w:szCs w:val="17"/>
               </w:rPr>
-              <w:t xml:space="preserve">reconciliation table in §1.7 — NOPAT CAGR and ROIC×RR anchors both shown</w:t>
+              <w:t xml:space="preserve">§1.7 — set below all three reconciliation anchors (12–16%); gap disclosed, not reconciled</w:t>
             </w:r>
           </w:p>
         </w:tc>
@@ -16525,7 +16525,7 @@
           <w:sz w:val="19"/>
           <w:szCs w:val="19"/>
         </w:rPr>
-        <w:t xml:space="preserve">The DCF bear/bull re-runs quoted in the valuation summary are full model re-executions, not a single-line haircut — the driver deltas, disclosed here for the first time so the 0.59–1.29 central range is fully auditable:</w:t>
+        <w:t xml:space="preserve">The DCF bear/bull re-runs quoted in the valuation summary are full model re-executions, not a single-line haircut — the driver deltas, disclosed here for the first time so the 0.59–1.20 central range is fully auditable:</w:t>
       </w:r>
     </w:p>
     <w:tbl>
@@ -16936,7 +16936,7 @@
                 <w:sz w:val="17"/>
                 <w:szCs w:val="17"/>
               </w:rPr>
-              <w:t xml:space="preserve">−1.0pp (10.5%)</w:t>
+              <w:t xml:space="preserve">−1.0pp (4.0%)</w:t>
             </w:r>
           </w:p>
         </w:tc>
@@ -16971,7 +16971,7 @@
                 <w:sz w:val="17"/>
                 <w:szCs w:val="17"/>
               </w:rPr>
-              <w:t xml:space="preserve">+1.0pp (12.5%)</w:t>
+              <w:t xml:space="preserve">+1.0pp (6.0%)</w:t>
             </w:r>
           </w:p>
         </w:tc>
@@ -17439,7 +17439,7 @@
                 <w:sz w:val="17"/>
                 <w:szCs w:val="17"/>
               </w:rPr>
-              <w:t xml:space="preserve">-0.50</w:t>
+              <w:t xml:space="preserve">-0.51</w:t>
             </w:r>
           </w:p>
         </w:tc>
@@ -17546,7 +17546,7 @@
                 <w:sz w:val="17"/>
                 <w:szCs w:val="17"/>
               </w:rPr>
-              <w:t xml:space="preserve">-0.21</w:t>
+              <w:t xml:space="preserve">-0.30</w:t>
             </w:r>
           </w:p>
         </w:tc>
@@ -17653,7 +17653,7 @@
                 <w:sz w:val="17"/>
                 <w:szCs w:val="17"/>
               </w:rPr>
-              <w:t xml:space="preserve">0.24</w:t>
+              <w:t xml:space="preserve">-0.02</w:t>
             </w:r>
           </w:p>
         </w:tc>
@@ -17760,7 +17760,7 @@
                 <w:sz w:val="17"/>
                 <w:szCs w:val="17"/>
               </w:rPr>
-              <w:t xml:space="preserve">0.99</w:t>
+              <w:t xml:space="preserve">0.36</w:t>
             </w:r>
           </w:p>
         </w:tc>
@@ -17833,7 +17833,7 @@
                 <w:sz w:val="17"/>
                 <w:szCs w:val="17"/>
               </w:rPr>
-              <w:t xml:space="preserve">16.07%</w:t>
+              <w:t xml:space="preserve">13.05%</w:t>
             </w:r>
           </w:p>
         </w:tc>
@@ -17977,7 +17977,7 @@
                 <w:sz w:val="17"/>
                 <w:szCs w:val="17"/>
               </w:rPr>
-              <w:t xml:space="preserve">3.16</w:t>
+              <w:t xml:space="preserve">1.07</w:t>
             </w:r>
           </w:p>
         </w:tc>
@@ -18134,7 +18134,7 @@
           <w:sz w:val="19"/>
           <w:szCs w:val="19"/>
         </w:rPr>
-        <w:t xml:space="preserve">The terminal uses the value-driver formula TV = NOPAT₆ × (1 − g/ROIC) / (WACC − g); capitalising FCFF directly is banned house-wide because it silently assumes free growth. With g 11.5% and terminal ROIC 22%, the reinvestment rate is 52.3% — the terminal firm keeps reinvesting half its NOPAT, forever, to grow at Egyptian nominal rates. Reconciliation against the company's own record:</w:t>
+        <w:t xml:space="preserve">The terminal uses the value-driver formula TV = NOPAT₆ × (1 − g/ROIC) / (WACC − g); capitalising FCFF directly is banned house-wide because it silently assumes free growth. With g 5% and terminal ROIC 22%, the reinvestment rate is 52.3% — the terminal firm reinvests roughly a fifth of its NOPAT, forever, to grow at 5% nominal. This is a deliberate conservative override (set 20-Jul-2026), not a figure the company's own record produces — the table below shows the gap plainly rather than reconciling around it:</w:t>
       </w:r>
     </w:p>
     <w:tbl>
@@ -18617,7 +18617,7 @@
                 <w:sz w:val="17"/>
                 <w:szCs w:val="17"/>
               </w:rPr>
-              <w:t xml:space="preserve">Egypt long-run nominal GDP (3rd anchor)</w:t>
+              <w:t xml:space="preserve">Egypt long-run nominal GDP</w:t>
             </w:r>
           </w:p>
         </w:tc>
@@ -18687,7 +18687,7 @@
                 <w:sz w:val="17"/>
                 <w:szCs w:val="17"/>
               </w:rPr>
-              <w:t xml:space="preserve">real ~4% + inflation converging toward the CBE 7%±2 target band — the sanity ceiling for any perpetual EGP growth rate</w:t>
+              <w:t xml:space="preserve">real ~4% + inflation converging toward the CBE 7%±2 target band — the level every anchor above clusters near</w:t>
             </w:r>
           </w:p>
         </w:tc>
@@ -18759,7 +18759,7 @@
                 <w:sz w:val="17"/>
                 <w:szCs w:val="17"/>
               </w:rPr>
-              <w:t xml:space="preserve">11.5%</w:t>
+              <w:t xml:space="preserve">5%</w:t>
             </w:r>
           </w:p>
         </w:tc>
@@ -18794,7 +18794,7 @@
                 <w:sz w:val="17"/>
                 <w:szCs w:val="17"/>
               </w:rPr>
-              <w:t xml:space="preserve">below the company anchors and inside the nominal-GDP band; ~long-run EGP inflation + modest real; WACC−g spread 12.0pp</w:t>
+              <w:t xml:space="preserve">well below all three anchors and below the nominal-GDP band — an explicit conservative override, not a reconciled figure; WACC−g spread widens to ~18.5pp</w:t>
             </w:r>
           </w:p>
         </w:tc>
@@ -18815,7 +18815,7 @@
           <w:sz w:val="17"/>
           <w:szCs w:val="17"/>
         </w:rPr>
-        <w:t xml:space="preserve">No stable years exist in a serial-devaluation sample — both anchors are shown and the adopted g sits below either, per the standing rule.</w:t>
+        <w:t xml:space="preserve">All three anchors point to 12–16%; the adopted 5% sits materially below every one of them by design. This is disclosed as a gap, not papered over — a reader who thinks the anchors are the better guide should re-run §1.1 at a higher g using the sensitivity grid in Figure 4.</w:t>
       </w:r>
     </w:p>
     <w:p>
@@ -19838,7 +19838,7 @@
                 <w:sz w:val="17"/>
                 <w:szCs w:val="17"/>
               </w:rPr>
-              <w:t xml:space="preserve">9.5%</w:t>
+              <w:t xml:space="preserve">3.0%</w:t>
             </w:r>
           </w:p>
         </w:tc>
@@ -19874,7 +19874,7 @@
                 <w:sz w:val="17"/>
                 <w:szCs w:val="17"/>
               </w:rPr>
-              <w:t xml:space="preserve">10.5%</w:t>
+              <w:t xml:space="preserve">4.0%</w:t>
             </w:r>
           </w:p>
         </w:tc>
@@ -19910,7 +19910,7 @@
                 <w:sz w:val="17"/>
                 <w:szCs w:val="17"/>
               </w:rPr>
-              <w:t xml:space="preserve">11.5%</w:t>
+              <w:t xml:space="preserve">5.0%</w:t>
             </w:r>
           </w:p>
         </w:tc>
@@ -19946,7 +19946,7 @@
                 <w:sz w:val="17"/>
                 <w:szCs w:val="17"/>
               </w:rPr>
-              <w:t xml:space="preserve">12.5%</w:t>
+              <w:t xml:space="preserve">6.0%</w:t>
             </w:r>
           </w:p>
         </w:tc>
@@ -19982,7 +19982,7 @@
                 <w:sz w:val="17"/>
                 <w:szCs w:val="17"/>
               </w:rPr>
-              <w:t xml:space="preserve">13.5%</w:t>
+              <w:t xml:space="preserve">7.0%</w:t>
             </w:r>
           </w:p>
         </w:tc>
@@ -20054,7 +20054,7 @@
                 <w:sz w:val="17"/>
                 <w:szCs w:val="17"/>
               </w:rPr>
-              <w:t xml:space="preserve">-0.07</w:t>
+              <w:t xml:space="preserve">-0.21</w:t>
             </w:r>
           </w:p>
         </w:tc>
@@ -20089,7 +20089,7 @@
                 <w:sz w:val="17"/>
                 <w:szCs w:val="17"/>
               </w:rPr>
-              <w:t xml:space="preserve">-0.04</w:t>
+              <w:t xml:space="preserve">-0.19</w:t>
             </w:r>
           </w:p>
         </w:tc>
@@ -20124,7 +20124,7 @@
                 <w:sz w:val="17"/>
                 <w:szCs w:val="17"/>
               </w:rPr>
-              <w:t xml:space="preserve">-0.01</w:t>
+              <w:t xml:space="preserve">-0.17</w:t>
             </w:r>
           </w:p>
         </w:tc>
@@ -20159,7 +20159,7 @@
                 <w:sz w:val="17"/>
                 <w:szCs w:val="17"/>
               </w:rPr>
-              <w:t xml:space="preserve">0.02</w:t>
+              <w:t xml:space="preserve">-0.15</w:t>
             </w:r>
           </w:p>
         </w:tc>
@@ -20194,7 +20194,7 @@
                 <w:sz w:val="17"/>
                 <w:szCs w:val="17"/>
               </w:rPr>
-              <w:t xml:space="preserve">0.07</w:t>
+              <w:t xml:space="preserve">-0.13</w:t>
             </w:r>
           </w:p>
         </w:tc>
@@ -20266,7 +20266,7 @@
                 <w:sz w:val="17"/>
                 <w:szCs w:val="17"/>
               </w:rPr>
-              <w:t xml:space="preserve">-0.24</w:t>
+              <w:t xml:space="preserve">-0.32</w:t>
             </w:r>
           </w:p>
         </w:tc>
@@ -20301,7 +20301,7 @@
                 <w:sz w:val="17"/>
                 <w:szCs w:val="17"/>
               </w:rPr>
-              <w:t xml:space="preserve">-0.23</w:t>
+              <w:t xml:space="preserve">-0.31</w:t>
             </w:r>
           </w:p>
         </w:tc>
@@ -20336,7 +20336,7 @@
                 <w:sz w:val="17"/>
                 <w:szCs w:val="17"/>
               </w:rPr>
-              <w:t xml:space="preserve">-0.21</w:t>
+              <w:t xml:space="preserve">-0.30</w:t>
             </w:r>
           </w:p>
         </w:tc>
@@ -20371,7 +20371,7 @@
                 <w:sz w:val="17"/>
                 <w:szCs w:val="17"/>
               </w:rPr>
-              <w:t xml:space="preserve">-0.19</w:t>
+              <w:t xml:space="preserve">-0.29</w:t>
             </w:r>
           </w:p>
         </w:tc>
@@ -20406,7 +20406,7 @@
                 <w:sz w:val="17"/>
                 <w:szCs w:val="17"/>
               </w:rPr>
-              <w:t xml:space="preserve">-0.17</w:t>
+              <w:t xml:space="preserve">-0.27</w:t>
             </w:r>
           </w:p>
         </w:tc>
@@ -20478,7 +20478,7 @@
                 <w:sz w:val="17"/>
                 <w:szCs w:val="17"/>
               </w:rPr>
-              <w:t xml:space="preserve">-0.38</w:t>
+              <w:t xml:space="preserve">-0.43</w:t>
             </w:r>
           </w:p>
         </w:tc>
@@ -20513,7 +20513,7 @@
                 <w:sz w:val="17"/>
                 <w:szCs w:val="17"/>
               </w:rPr>
-              <w:t xml:space="preserve">-0.37</w:t>
+              <w:t xml:space="preserve">-0.42</w:t>
             </w:r>
           </w:p>
         </w:tc>
@@ -20548,7 +20548,7 @@
                 <w:sz w:val="17"/>
                 <w:szCs w:val="17"/>
               </w:rPr>
-              <w:t xml:space="preserve">-0.37</w:t>
+              <w:t xml:space="preserve">-0.41</w:t>
             </w:r>
           </w:p>
         </w:tc>
@@ -20583,7 +20583,7 @@
                 <w:sz w:val="17"/>
                 <w:szCs w:val="17"/>
               </w:rPr>
-              <w:t xml:space="preserve">-0.37</w:t>
+              <w:t xml:space="preserve">-0.40</w:t>
             </w:r>
           </w:p>
         </w:tc>
@@ -20618,7 +20618,7 @@
                 <w:sz w:val="17"/>
                 <w:szCs w:val="17"/>
               </w:rPr>
-              <w:t xml:space="preserve">-0.36</w:t>
+              <w:t xml:space="preserve">-0.40</w:t>
             </w:r>
           </w:p>
         </w:tc>
@@ -20692,151 +20692,151 @@
                 <w:sz w:val="17"/>
                 <w:szCs w:val="17"/>
               </w:rPr>
+              <w:t xml:space="preserve">-0.52</w:t>
+            </w:r>
+          </w:p>
+        </w:tc>
+        <w:tc>
+          <w:tcPr>
+            <w:tcW w:type="dxa" w:w="1580"/>
+            <w:tcBorders>
+              <w:top w:val="single" w:color="CCCCCC" w:sz="2"/>
+              <w:left w:val="single" w:color="DDDDDD" w:sz="2"/>
+              <w:bottom w:val="single" w:color="CCCCCC" w:sz="2"/>
+              <w:right w:val="single" w:color="DDDDDD" w:sz="2"/>
+            </w:tcBorders>
+            <w:shd w:fill="F5F1E6" w:val="clear"/>
+            <w:tcMar>
+              <w:top w:type="dxa" w:w="40"/>
+              <w:left w:type="dxa" w:w="80"/>
+              <w:bottom w:type="dxa" w:w="40"/>
+              <w:right w:type="dxa" w:w="80"/>
+            </w:tcMar>
+          </w:tcPr>
+          <w:p>
+            <w:pPr>
+              <w:spacing w:after="10" w:before="10"/>
+            </w:pPr>
+            <w:r>
+              <w:rPr>
+                <w:rFonts w:ascii="Georgia" w:cs="Georgia" w:eastAsia="Georgia" w:hAnsi="Georgia"/>
+                <w:b w:val="false"/>
+                <w:bCs w:val="false"/>
+                <w:i w:val="false"/>
+                <w:iCs w:val="false"/>
+                <w:color w:val="222222"/>
+                <w:sz w:val="17"/>
+                <w:szCs w:val="17"/>
+              </w:rPr>
+              <w:t xml:space="preserve">-0.52</w:t>
+            </w:r>
+          </w:p>
+        </w:tc>
+        <w:tc>
+          <w:tcPr>
+            <w:tcW w:type="dxa" w:w="1580"/>
+            <w:tcBorders>
+              <w:top w:val="single" w:color="CCCCCC" w:sz="2"/>
+              <w:left w:val="single" w:color="DDDDDD" w:sz="2"/>
+              <w:bottom w:val="single" w:color="CCCCCC" w:sz="2"/>
+              <w:right w:val="single" w:color="DDDDDD" w:sz="2"/>
+            </w:tcBorders>
+            <w:shd w:fill="F5F1E6" w:val="clear"/>
+            <w:tcMar>
+              <w:top w:type="dxa" w:w="40"/>
+              <w:left w:type="dxa" w:w="80"/>
+              <w:bottom w:type="dxa" w:w="40"/>
+              <w:right w:type="dxa" w:w="80"/>
+            </w:tcMar>
+          </w:tcPr>
+          <w:p>
+            <w:pPr>
+              <w:spacing w:after="10" w:before="10"/>
+            </w:pPr>
+            <w:r>
+              <w:rPr>
+                <w:rFonts w:ascii="Georgia" w:cs="Georgia" w:eastAsia="Georgia" w:hAnsi="Georgia"/>
+                <w:b w:val="false"/>
+                <w:bCs w:val="false"/>
+                <w:i w:val="false"/>
+                <w:iCs w:val="false"/>
+                <w:color w:val="222222"/>
+                <w:sz w:val="17"/>
+                <w:szCs w:val="17"/>
+              </w:rPr>
+              <w:t xml:space="preserve">-0.51</w:t>
+            </w:r>
+          </w:p>
+        </w:tc>
+        <w:tc>
+          <w:tcPr>
+            <w:tcW w:type="dxa" w:w="1580"/>
+            <w:tcBorders>
+              <w:top w:val="single" w:color="CCCCCC" w:sz="2"/>
+              <w:left w:val="single" w:color="DDDDDD" w:sz="2"/>
+              <w:bottom w:val="single" w:color="CCCCCC" w:sz="2"/>
+              <w:right w:val="single" w:color="DDDDDD" w:sz="2"/>
+            </w:tcBorders>
+            <w:shd w:fill="F5F1E6" w:val="clear"/>
+            <w:tcMar>
+              <w:top w:type="dxa" w:w="40"/>
+              <w:left w:type="dxa" w:w="80"/>
+              <w:bottom w:type="dxa" w:w="40"/>
+              <w:right w:type="dxa" w:w="80"/>
+            </w:tcMar>
+          </w:tcPr>
+          <w:p>
+            <w:pPr>
+              <w:spacing w:after="10" w:before="10"/>
+            </w:pPr>
+            <w:r>
+              <w:rPr>
+                <w:rFonts w:ascii="Georgia" w:cs="Georgia" w:eastAsia="Georgia" w:hAnsi="Georgia"/>
+                <w:b w:val="false"/>
+                <w:bCs w:val="false"/>
+                <w:i w:val="false"/>
+                <w:iCs w:val="false"/>
+                <w:color w:val="222222"/>
+                <w:sz w:val="17"/>
+                <w:szCs w:val="17"/>
+              </w:rPr>
+              <w:t xml:space="preserve">-0.51</w:t>
+            </w:r>
+          </w:p>
+        </w:tc>
+        <w:tc>
+          <w:tcPr>
+            <w:tcW w:type="dxa" w:w="1580"/>
+            <w:tcBorders>
+              <w:top w:val="single" w:color="CCCCCC" w:sz="2"/>
+              <w:left w:val="single" w:color="DDDDDD" w:sz="2"/>
+              <w:bottom w:val="single" w:color="CCCCCC" w:sz="2"/>
+              <w:right w:val="single" w:color="DDDDDD" w:sz="2"/>
+            </w:tcBorders>
+            <w:shd w:fill="F5F1E6" w:val="clear"/>
+            <w:tcMar>
+              <w:top w:type="dxa" w:w="40"/>
+              <w:left w:type="dxa" w:w="80"/>
+              <w:bottom w:type="dxa" w:w="40"/>
+              <w:right w:type="dxa" w:w="80"/>
+            </w:tcMar>
+          </w:tcPr>
+          <w:p>
+            <w:pPr>
+              <w:spacing w:after="10" w:before="10"/>
+            </w:pPr>
+            <w:r>
+              <w:rPr>
+                <w:rFonts w:ascii="Georgia" w:cs="Georgia" w:eastAsia="Georgia" w:hAnsi="Georgia"/>
+                <w:b w:val="false"/>
+                <w:bCs w:val="false"/>
+                <w:i w:val="false"/>
+                <w:iCs w:val="false"/>
+                <w:color w:val="222222"/>
+                <w:sz w:val="17"/>
+                <w:szCs w:val="17"/>
+              </w:rPr>
               <w:t xml:space="preserve">-0.50</w:t>
-            </w:r>
-          </w:p>
-        </w:tc>
-        <w:tc>
-          <w:tcPr>
-            <w:tcW w:type="dxa" w:w="1580"/>
-            <w:tcBorders>
-              <w:top w:val="single" w:color="CCCCCC" w:sz="2"/>
-              <w:left w:val="single" w:color="DDDDDD" w:sz="2"/>
-              <w:bottom w:val="single" w:color="CCCCCC" w:sz="2"/>
-              <w:right w:val="single" w:color="DDDDDD" w:sz="2"/>
-            </w:tcBorders>
-            <w:shd w:fill="F5F1E6" w:val="clear"/>
-            <w:tcMar>
-              <w:top w:type="dxa" w:w="40"/>
-              <w:left w:type="dxa" w:w="80"/>
-              <w:bottom w:type="dxa" w:w="40"/>
-              <w:right w:type="dxa" w:w="80"/>
-            </w:tcMar>
-          </w:tcPr>
-          <w:p>
-            <w:pPr>
-              <w:spacing w:after="10" w:before="10"/>
-            </w:pPr>
-            <w:r>
-              <w:rPr>
-                <w:rFonts w:ascii="Georgia" w:cs="Georgia" w:eastAsia="Georgia" w:hAnsi="Georgia"/>
-                <w:b w:val="false"/>
-                <w:bCs w:val="false"/>
-                <w:i w:val="false"/>
-                <w:iCs w:val="false"/>
-                <w:color w:val="222222"/>
-                <w:sz w:val="17"/>
-                <w:szCs w:val="17"/>
-              </w:rPr>
-              <w:t xml:space="preserve">-0.50</w:t>
-            </w:r>
-          </w:p>
-        </w:tc>
-        <w:tc>
-          <w:tcPr>
-            <w:tcW w:type="dxa" w:w="1580"/>
-            <w:tcBorders>
-              <w:top w:val="single" w:color="CCCCCC" w:sz="2"/>
-              <w:left w:val="single" w:color="DDDDDD" w:sz="2"/>
-              <w:bottom w:val="single" w:color="CCCCCC" w:sz="2"/>
-              <w:right w:val="single" w:color="DDDDDD" w:sz="2"/>
-            </w:tcBorders>
-            <w:shd w:fill="F5F1E6" w:val="clear"/>
-            <w:tcMar>
-              <w:top w:type="dxa" w:w="40"/>
-              <w:left w:type="dxa" w:w="80"/>
-              <w:bottom w:type="dxa" w:w="40"/>
-              <w:right w:type="dxa" w:w="80"/>
-            </w:tcMar>
-          </w:tcPr>
-          <w:p>
-            <w:pPr>
-              <w:spacing w:after="10" w:before="10"/>
-            </w:pPr>
-            <w:r>
-              <w:rPr>
-                <w:rFonts w:ascii="Georgia" w:cs="Georgia" w:eastAsia="Georgia" w:hAnsi="Georgia"/>
-                <w:b w:val="false"/>
-                <w:bCs w:val="false"/>
-                <w:i w:val="false"/>
-                <w:iCs w:val="false"/>
-                <w:color w:val="222222"/>
-                <w:sz w:val="17"/>
-                <w:szCs w:val="17"/>
-              </w:rPr>
-              <w:t xml:space="preserve">-0.50</w:t>
-            </w:r>
-          </w:p>
-        </w:tc>
-        <w:tc>
-          <w:tcPr>
-            <w:tcW w:type="dxa" w:w="1580"/>
-            <w:tcBorders>
-              <w:top w:val="single" w:color="CCCCCC" w:sz="2"/>
-              <w:left w:val="single" w:color="DDDDDD" w:sz="2"/>
-              <w:bottom w:val="single" w:color="CCCCCC" w:sz="2"/>
-              <w:right w:val="single" w:color="DDDDDD" w:sz="2"/>
-            </w:tcBorders>
-            <w:shd w:fill="F5F1E6" w:val="clear"/>
-            <w:tcMar>
-              <w:top w:type="dxa" w:w="40"/>
-              <w:left w:type="dxa" w:w="80"/>
-              <w:bottom w:type="dxa" w:w="40"/>
-              <w:right w:type="dxa" w:w="80"/>
-            </w:tcMar>
-          </w:tcPr>
-          <w:p>
-            <w:pPr>
-              <w:spacing w:after="10" w:before="10"/>
-            </w:pPr>
-            <w:r>
-              <w:rPr>
-                <w:rFonts w:ascii="Georgia" w:cs="Georgia" w:eastAsia="Georgia" w:hAnsi="Georgia"/>
-                <w:b w:val="false"/>
-                <w:bCs w:val="false"/>
-                <w:i w:val="false"/>
-                <w:iCs w:val="false"/>
-                <w:color w:val="222222"/>
-                <w:sz w:val="17"/>
-                <w:szCs w:val="17"/>
-              </w:rPr>
-              <w:t xml:space="preserve">-0.51</w:t>
-            </w:r>
-          </w:p>
-        </w:tc>
-        <w:tc>
-          <w:tcPr>
-            <w:tcW w:type="dxa" w:w="1580"/>
-            <w:tcBorders>
-              <w:top w:val="single" w:color="CCCCCC" w:sz="2"/>
-              <w:left w:val="single" w:color="DDDDDD" w:sz="2"/>
-              <w:bottom w:val="single" w:color="CCCCCC" w:sz="2"/>
-              <w:right w:val="single" w:color="DDDDDD" w:sz="2"/>
-            </w:tcBorders>
-            <w:shd w:fill="F5F1E6" w:val="clear"/>
-            <w:tcMar>
-              <w:top w:type="dxa" w:w="40"/>
-              <w:left w:type="dxa" w:w="80"/>
-              <w:bottom w:type="dxa" w:w="40"/>
-              <w:right w:type="dxa" w:w="80"/>
-            </w:tcMar>
-          </w:tcPr>
-          <w:p>
-            <w:pPr>
-              <w:spacing w:after="10" w:before="10"/>
-            </w:pPr>
-            <w:r>
-              <w:rPr>
-                <w:rFonts w:ascii="Georgia" w:cs="Georgia" w:eastAsia="Georgia" w:hAnsi="Georgia"/>
-                <w:b w:val="false"/>
-                <w:bCs w:val="false"/>
-                <w:i w:val="false"/>
-                <w:iCs w:val="false"/>
-                <w:color w:val="222222"/>
-                <w:sz w:val="17"/>
-                <w:szCs w:val="17"/>
-              </w:rPr>
-              <w:t xml:space="preserve">-0.51</w:t>
             </w:r>
           </w:p>
         </w:tc>
@@ -20943,7 +20943,7 @@
                 <w:sz w:val="17"/>
                 <w:szCs w:val="17"/>
               </w:rPr>
-              <w:t xml:space="preserve">-0.61</w:t>
+              <w:t xml:space="preserve">-0.60</w:t>
             </w:r>
           </w:p>
         </w:tc>
@@ -20978,7 +20978,7 @@
                 <w:sz w:val="17"/>
                 <w:szCs w:val="17"/>
               </w:rPr>
-              <w:t xml:space="preserve">-0.61</w:t>
+              <w:t xml:space="preserve">-0.60</w:t>
             </w:r>
           </w:p>
         </w:tc>
@@ -21013,7 +21013,7 @@
                 <w:sz w:val="17"/>
                 <w:szCs w:val="17"/>
               </w:rPr>
-              <w:t xml:space="preserve">-0.62</w:t>
+              <w:t xml:space="preserve">-0.60</w:t>
             </w:r>
           </w:p>
         </w:tc>
@@ -21048,7 +21048,7 @@
                 <w:sz w:val="17"/>
                 <w:szCs w:val="17"/>
               </w:rPr>
-              <w:t xml:space="preserve">-0.63</w:t>
+              <w:t xml:space="preserve">-0.60</w:t>
             </w:r>
           </w:p>
         </w:tc>
@@ -21120,7 +21120,7 @@
                 <w:sz w:val="17"/>
                 <w:szCs w:val="17"/>
               </w:rPr>
-              <w:t xml:space="preserve">-0.69</w:t>
+              <w:t xml:space="preserve">-0.68</w:t>
             </w:r>
           </w:p>
         </w:tc>
@@ -21155,7 +21155,7 @@
                 <w:sz w:val="17"/>
                 <w:szCs w:val="17"/>
               </w:rPr>
-              <w:t xml:space="preserve">-0.70</w:t>
+              <w:t xml:space="preserve">-0.68</w:t>
             </w:r>
           </w:p>
         </w:tc>
@@ -21190,7 +21190,7 @@
                 <w:sz w:val="17"/>
                 <w:szCs w:val="17"/>
               </w:rPr>
-              <w:t xml:space="preserve">-0.71</w:t>
+              <w:t xml:space="preserve">-0.68</w:t>
             </w:r>
           </w:p>
         </w:tc>
@@ -21225,7 +21225,7 @@
                 <w:sz w:val="17"/>
                 <w:szCs w:val="17"/>
               </w:rPr>
-              <w:t xml:space="preserve">-0.72</w:t>
+              <w:t xml:space="preserve">-0.68</w:t>
             </w:r>
           </w:p>
         </w:tc>
@@ -21260,7 +21260,7 @@
                 <w:sz w:val="17"/>
                 <w:szCs w:val="17"/>
               </w:rPr>
-              <w:t xml:space="preserve">-0.74</w:t>
+              <w:t xml:space="preserve">-0.68</w:t>
             </w:r>
           </w:p>
         </w:tc>
@@ -21632,7 +21632,7 @@
                 <w:sz w:val="17"/>
                 <w:szCs w:val="17"/>
               </w:rPr>
-              <w:t xml:space="preserve">-0.36</w:t>
+              <w:t xml:space="preserve">-0.40</w:t>
             </w:r>
           </w:p>
         </w:tc>
@@ -21774,7 +21774,7 @@
                 <w:sz w:val="17"/>
                 <w:szCs w:val="17"/>
               </w:rPr>
-              <w:t xml:space="preserve">-0.43</w:t>
+              <w:t xml:space="preserve">-0.46</w:t>
             </w:r>
           </w:p>
         </w:tc>
@@ -21920,7 +21920,7 @@
                 <w:sz w:val="17"/>
                 <w:szCs w:val="17"/>
               </w:rPr>
-              <w:t xml:space="preserve">-0.50</w:t>
+              <w:t xml:space="preserve">-0.51</w:t>
             </w:r>
           </w:p>
         </w:tc>
@@ -22204,7 +22204,7 @@
                 <w:sz w:val="17"/>
                 <w:szCs w:val="17"/>
               </w:rPr>
-              <w:t xml:space="preserve">-0.62</w:t>
+              <w:t xml:space="preserve">-0.61</w:t>
             </w:r>
           </w:p>
         </w:tc>
@@ -22346,7 +22346,7 @@
                 <w:sz w:val="17"/>
                 <w:szCs w:val="17"/>
               </w:rPr>
-              <w:t xml:space="preserve">-0.67</w:t>
+              <w:t xml:space="preserve">-0.65</w:t>
             </w:r>
           </w:p>
         </w:tc>
@@ -28797,7 +28797,7 @@
           <w:sz w:val="19"/>
           <w:szCs w:val="19"/>
         </w:rPr>
-        <w:t xml:space="preserve">Three clocks, kept deliberately separate. The 60-session clock is the Monte Carlo's: a +4% centre that is precisely the money-market carry, 61.1% above spot, odds 2.05 on ±10% — an event tape (the H1 print, the August and October MPCs, the funding question) around Egypt's cost of money. The ~12-month clock is the weighted fundamental central of 0.88: the market trades roughly double it, which at today's sourced rates is a statement about the discount rate the market has chosen to use, not about demand for garments. The multi-year clock is the conditional one: at the market-implied WACC of 16.1% — a completed easing cycle — the same model is worth spot; at 15% it is worth 3.16. The stock is, functionally, a leveraged option on Egyptian disinflation with a garment factory attached.</w:t>
+        <w:t xml:space="preserve">Three clocks, kept deliberately separate. The 60-session clock is the Monte Carlo's: a +4% centre that is precisely the money-market carry, 61.1% above spot, odds 2.05 on ±10% — an event tape (the H1 print, the August and October MPCs, the funding question) around Egypt's cost of money. The ~12-month clock is the weighted fundamental central of 0.88: the market trades roughly double it, which at today's sourced rates is a statement about the discount rate the market has chosen to use, not about demand for garments. The multi-year clock is the conditional one: at the market-implied WACC of 13.05% — a completed easing cycle — the same model is worth spot; at 15% it is worth 1.07. The stock is, functionally, a leveraged option on Egyptian disinflation with a garment factory attached.</w:t>
       </w:r>
     </w:p>
     <w:tbl>
@@ -29173,7 +29173,7 @@
                 <w:sz w:val="17"/>
                 <w:szCs w:val="17"/>
               </w:rPr>
-              <w:t xml:space="preserve">central 0.88 (0.59–1.29)</w:t>
+              <w:t xml:space="preserve">central 0.88 (0.59–1.20)</w:t>
             </w:r>
           </w:p>
         </w:tc>
@@ -29315,7 +29315,7 @@
                 <w:sz w:val="17"/>
                 <w:szCs w:val="17"/>
               </w:rPr>
-              <w:t xml:space="preserve">1.94 at WACC 16.1% · 3.16 at 15%</w:t>
+              <w:t xml:space="preserve">1.94 at WACC 13.05% · 1.07 at 15%</w:t>
             </w:r>
           </w:p>
         </w:tc>
@@ -43053,7 +43053,7 @@
           <w:sz w:val="19"/>
           <w:szCs w:val="19"/>
         </w:rPr>
-        <w:t xml:space="preserve">Worldview: in Egypt, policy outranks fundamentals — the rate path and the FX regime move this equity more than management can. Workings: three states, each a full re-run of the base model, probability-weighted. (a) Full easing (35%): the CBE reaches low-teens by 2028, the 10Y settles ~16.5% — re-running the base model at that WACC (~20.0%) gives DCF ~0.10, blended ~0.92. (b) Partial easing (45%): rates fall but the 10Y holds ~19.5%; the DCF is ~0.24 and the market lenses carry the weight — blended ~0.90. (c) Stall or funding shock (20%): easing pauses, the equity raise happens at depressed prices; the branch prices the pre-money value's decline but not the cash raised — a conservative, explicitly stated choice, not a standard treatment — landing near 0.35. Weighted: 0.35×0.92 + 0.45×0.90 + 0.20×0.35 = 0.80. When it works / when it fails: best in policy-driven markets with binary catalysts and FX/rate regimes in flux; it fails through false precision — the probabilities are judgements, and the tree can miss the branch that grows.</w:t>
+        <w:t xml:space="preserve">Worldview: in Egypt, policy outranks fundamentals — the rate path and the FX regime move this equity more than management can. Workings: three states, each a full re-run of the base model, probability-weighted. (a) Full easing (35%): the CBE reaches low-teens by 2028, the 10Y settles ~16.5% — re-running the base model at that WACC (~20.0%) still gives a DCF of −0.10 at the now-lower terminal growth; floored, blended ~0.88. (b) Partial easing (45%): rates fall but the 10Y holds ~19.5%; the DCF is ~−0.02, essentially the crossover point — floored, blended ~0.88. (c) Stall or funding shock (20%): easing pauses, the equity raise happens at depressed prices; the branch prices the pre-money value's decline but not the cash raised — a conservative, explicitly stated choice, not a standard treatment — landing near 0.35. Weighted: 0.35×0.88 + 0.45×0.88 + 0.20×0.35 = 0.78. At the 5% terminal growth now in force, branches (a) and (b) have converged — the DCF only clears zero below ~19% WACC, a materially harder bar than under the study's earlier 11.5% terminal assumption. When it works / when it fails: best in policy-driven markets with binary catalysts and FX/rate regimes in flux; it fails through false precision — the probabilities are judgements, and the tree can miss the branch that grows.</w:t>
       </w:r>
     </w:p>
     <w:p>
@@ -43089,7 +43089,7 @@
           <w:sz w:val="19"/>
           <w:szCs w:val="19"/>
         </w:rPr>
-        <w:t xml:space="preserve">Verdict 1.09 (0.90–1.30 on ±10pp probability shifts). Falsification: a fourth, unmodelled policy branch dominating — a capital-control regime or an IMF-programme rupture would invalidate the tree, not just re-weight it.</w:t>
+        <w:t xml:space="preserve">Verdict 0.78 (0.72–0.83 on ±10pp probability shifts). Falsification: a fourth, unmodelled policy branch dominating — a capital-control regime or an IMF-programme rupture would invalidate the tree, not just re-weight it.</w:t>
       </w:r>
     </w:p>
     <w:p>
@@ -43200,7 +43200,7 @@
           <w:sz w:val="19"/>
           <w:szCs w:val="19"/>
         </w:rPr>
-        <w:t xml:space="preserve">"You are both valuing this company as if the discount rate were a constant of nature. It is the single variable that moved the answer from negative to 3.16 inside one table. Refusing to weight the policy states is not caution — it is a 100% bet on today's rate lasting forever."</w:t>
+        <w:t xml:space="preserve">"You are both valuing this company as if the discount rate were a constant of nature. It is the single variable that moved the answer from negative to 1.07 inside one table. Refusing to weight the policy states is not caution — it is a 100% bet on today's rate lasting forever."</w:t>
       </w:r>
     </w:p>
     <w:p>
@@ -43236,7 +43236,7 @@
           <w:sz w:val="19"/>
           <w:szCs w:val="19"/>
         </w:rPr>
-        <w:t xml:space="preserve">Expert 1 (0.15) prices the balance sheet, Expert 2 (1.63) prices the machine, Expert 3 (1.09) prices the regime — and none of the three reaches the market's 1.94. That is the finding: spot requires Expert 2's normalized earnings AND Expert 3's full-easing branch to both come true, simultaneously, with no funding accident on the way. The study's central (0.88) sits between the accountant and the strategist, which is where a leveraged, cash-hungry, genuinely growing exporter belongs while the policy question is open.</w:t>
+        <w:t xml:space="preserve">Expert 1 (0.15) prices the balance sheet, Expert 2 (1.63) prices the machine, Expert 3 (0.78) prices the regime — and none of the three reaches the market's 1.94. That is the finding: spot requires Expert 2's normalized earnings AND Expert 3's full-easing branch to both come true, simultaneously, with no funding accident on the way. The study's central (0.88) sits between the accountant and the strategist, which is where a leveraged, cash-hungry, genuinely growing exporter belongs while the policy question is open.</w:t>
       </w:r>
     </w:p>
     <w:p>

</xml_diff>